<commit_message>
Día 4: FEAT-002 filtros combinables
Filtros de estado y prioridad combinados con la búsqueda (filtrar() en el gestor), botón Limpiar filtros, mensaje ante cero resultados y pruebas en test/filtros_test.dart (32/32 en total). Incluye la bitácora del Día 4, el reporte final de tickets y el resumen.
</commit_message>
<xml_diff>
--- a/nexasoft_incidencias/docs/Bitacora_Diaria_1.docx
+++ b/nexasoft_incidencias/docs/Bitacora_Diaria_1.docx
@@ -2101,7 +2101,7 @@
               <w:rPr>
                 <w:sz w:val="17"/>
               </w:rPr>
-              <w:t>b4887f0</w:t>
+              <w:t xml:space="preserve">9c6d1fd</w:t>
             </w:r>
           </w:p>
           <w:p>
@@ -2187,29 +2187,7 @@
               <w:rPr>
                 <w:sz w:val="17"/>
               </w:rPr>
-              <w:t>b49f713</w:t>
-            </w:r>
-          </w:p>
-          <w:p>
-            <w:pPr>
-              <w:spacing w:after="40"/>
-            </w:pPr>
-            <w:r>
-              <w:rPr>
-                <w:sz w:val="17"/>
-              </w:rPr>
-              <w:t>45d7eaa</w:t>
-            </w:r>
-          </w:p>
-          <w:p>
-            <w:pPr>
-              <w:spacing w:after="0"/>
-            </w:pPr>
-            <w:r>
-              <w:rPr>
-                <w:sz w:val="17"/>
-              </w:rPr>
-              <w:t>2f340ce</w:t>
+              <w:t xml:space="preserve">9c6d1fd</w:t>
             </w:r>
           </w:p>
         </w:tc>

</xml_diff>